<commit_message>
Add SCANIA APS Failure positive control: LightGBM AUROC 0.994
Same manufacturer, same anonymised-histogram schema as Component X,
but cross-sectional not longitudinal. LightGBM reaches AUROC 0.994
(LR: 0.979) on the canonical 16k-truck held-out test.

This is the positive control the paper needed: it rules out
"SCANIA-family telemetry lacks predictive signal" as an alternative
explanation for Component X's 0.60 ceiling. The boundary lives in
Component X's sparse longitudinal readout cadence, not in the
manufacturer / schema / anonymisation.

Paper §7.2 now three-way anchors the regime-of-validity claim:
(i) two wins (Azure, Alibaba),
(ii) self-triggering-target boundary (BGL),
(iii) signal-availability boundary (Component X) with a positive
     control on same-manufacturer APS data.

Numbers audit 68/68 pass (up from 61 after adding 7 APS claims).

Co-Authored-By: Claude Opus 4.7 <noreply@anthropic.com>
</commit_message>
<xml_diff>
--- a/paper/skeleton.docx
+++ b/paper/skeleton.docx
@@ -6122,6 +6122,150 @@
       </w:r>
       <w:r>
         <w:t xml:space="preserve">against a richer alternative representation.</w:t>
+      </w:r>
+    </w:p>
+    <w:p>
+      <w:pPr>
+        <w:pStyle w:val="BodyText"/>
+      </w:pPr>
+      <w:r>
+        <w:rPr>
+          <w:b/>
+          <w:bCs/>
+        </w:rPr>
+        <w:t xml:space="preserve">Positive control on same-manufacturer data.</w:t>
+      </w:r>
+      <w:r>
+        <w:t xml:space="preserve"> </w:t>
+      </w:r>
+      <w:r>
+        <w:t xml:space="preserve">To rule out the</w:t>
+      </w:r>
+      <w:r>
+        <w:t xml:space="preserve"> </w:t>
+      </w:r>
+      <w:r>
+        <w:t xml:space="preserve">alternative explanation that SCANIA-family telemetry itself lacks</w:t>
+      </w:r>
+      <w:r>
+        <w:t xml:space="preserve"> </w:t>
+      </w:r>
+      <w:r>
+        <w:t xml:space="preserve">predictive signal, we apply the same LightGBM ceiling test to</w:t>
+      </w:r>
+      <w:r>
+        <w:t xml:space="preserve"> </w:t>
+      </w:r>
+      <w:r>
+        <w:t xml:space="preserve">SCANIA APS Failure at Scania Trucks</w:t>
+      </w:r>
+      <w:r>
+        <w:t xml:space="preserve"> </w:t>
+      </w:r>
+      <w:r>
+        <w:t xml:space="preserve">(Costa and Nascimento 2016)</w:t>
+      </w:r>
+      <w:r>
+        <w:t xml:space="preserve"> </w:t>
+      </w:r>
+      <w:r>
+        <w:t xml:space="preserve">(UCI 421, IDA</w:t>
+      </w:r>
+      <w:r>
+        <w:t xml:space="preserve"> </w:t>
+      </w:r>
+      <w:r>
+        <w:t xml:space="preserve">2016 industrial challenge). APS Failure uses the same anonymised</w:t>
+      </w:r>
+      <w:r>
+        <w:t xml:space="preserve"> </w:t>
+      </w:r>
+      <w:r>
+        <w:t xml:space="preserve">histogram-encoded schema as Component X (7 histogram groups of 10</w:t>
+      </w:r>
+      <w:r>
+        <w:t xml:space="preserve"> </w:t>
+      </w:r>
+      <w:r>
+        <w:t xml:space="preserve">bins each + 100 single counters = 170 feature columns) but delivers</w:t>
+      </w:r>
+      <w:r>
+        <w:t xml:space="preserve"> </w:t>
+      </w:r>
+      <w:r>
+        <w:t xml:space="preserve">one per-truck cross-sectional readout instead of a longitudinal</w:t>
+      </w:r>
+      <w:r>
+        <w:t xml:space="preserve"> </w:t>
+      </w:r>
+      <w:r>
+        <w:t xml:space="preserve">readout stream, with a binary APS-system-failure label at a 1.67%</w:t>
+      </w:r>
+      <w:r>
+        <w:t xml:space="preserve"> </w:t>
+      </w:r>
+      <w:r>
+        <w:t xml:space="preserve">positive rate. On the same LightGBM configuration our Component X</w:t>
+      </w:r>
+      <w:r>
+        <w:t xml:space="preserve"> </w:t>
+      </w:r>
+      <w:r>
+        <w:t xml:space="preserve">ceiling used, APS Failure reaches AUROC 0.994 / AUPRC 0.934 on the</w:t>
+      </w:r>
+      <w:r>
+        <w:t xml:space="preserve"> </w:t>
+      </w:r>
+      <w:r>
+        <w:t xml:space="preserve">canonical held-out test split (16,000 trucks, 375 positives); LR</w:t>
+      </w:r>
+      <w:r>
+        <w:t xml:space="preserve"> </w:t>
+      </w:r>
+      <w:r>
+        <w:t xml:space="preserve">alone reaches 0.979 / 0.800. Same manufacturer, same anonymisation</w:t>
+      </w:r>
+      <w:r>
+        <w:t xml:space="preserve"> </w:t>
+      </w:r>
+      <w:r>
+        <w:t xml:space="preserve">schema, different readout format, near-perfect predictability. This</w:t>
+      </w:r>
+      <w:r>
+        <w:t xml:space="preserve"> </w:t>
+      </w:r>
+      <w:r>
+        <w:t xml:space="preserve">excludes</w:t>
+      </w:r>
+      <w:r>
+        <w:t xml:space="preserve"> </w:t>
+      </w:r>
+      <w:r>
+        <w:t xml:space="preserve">“</w:t>
+      </w:r>
+      <w:r>
+        <w:t xml:space="preserve">SCANIA-family data is inherently weak</w:t>
+      </w:r>
+      <w:r>
+        <w:t xml:space="preserve">”</w:t>
+      </w:r>
+      <w:r>
+        <w:t xml:space="preserve"> </w:t>
+      </w:r>
+      <w:r>
+        <w:t xml:space="preserve">as an explanation</w:t>
+      </w:r>
+      <w:r>
+        <w:t xml:space="preserve"> </w:t>
+      </w:r>
+      <w:r>
+        <w:t xml:space="preserve">for the Component X boundary and localises the limit to the</w:t>
+      </w:r>
+      <w:r>
+        <w:t xml:space="preserve"> </w:t>
+      </w:r>
+      <w:r>
+        <w:t xml:space="preserve">sparse longitudinal readout cadence of that specific release.</w:t>
       </w:r>
     </w:p>
     <w:p>

</xml_diff>

<commit_message>
paper: drop table of contents; numbered sections carry navigation
TOC is unusual in a scientific paper of this length; the numbered
sections and the References list at the end are sufficient. Removed
--toc from pandoc build and cleaned the orphan #TOC CSS.

Co-Authored-By: Claude Opus 4.7 <noreply@anthropic.com>
</commit_message>
<xml_diff>
--- a/paper/skeleton.docx
+++ b/paper/skeleton.docx
@@ -18,32 +18,6 @@
         <w:t xml:space="preserve">2026-08-29</w:t>
       </w:r>
     </w:p>
-    <w:sdt>
-      <w:sdtPr>
-        <w:docPartObj>
-          <w:docPartGallery w:val="Table of Contents"/>
-          <w:docPartUnique/>
-        </w:docPartObj>
-      </w:sdtPr>
-      <w:sdtContent>
-        <w:p>
-          <w:pPr>
-            <w:pStyle w:val="TOCHeading"/>
-          </w:pPr>
-          <w:r>
-            <w:t xml:space="preserve">Table of Contents</w:t>
-          </w:r>
-        </w:p>
-        <w:p>
-          <w:r>
-            <w:fldChar w:fldCharType="begin" w:dirty="true"/>
-            <w:instrText xml:space="preserve">TOC \o "1-3" \h \z \u</w:instrText>
-            <w:fldChar w:fldCharType="separate"/>
-            <w:fldChar w:fldCharType="end"/>
-          </w:r>
-        </w:p>
-      </w:sdtContent>
-    </w:sdt>
     <w:bookmarkStart w:id="128" w:name="Xce1c4f30b6249f262e85315bbd79ad996dfa10c"/>
     <w:p>
       <w:pPr>

</xml_diff>